<commit_message>
refactor(pai): adopt storytelling object metaphors (nahkoda lisensi, pohon kebaikan) and remove jargon labels
</commit_message>
<xml_diff>
--- a/docs/Catatan_Belajar_Siswa_PAI_Bab4.docx
+++ b/docs/Catatan_Belajar_Siswa_PAI_Bab4.docx
@@ -54,7 +54,7 @@
                 <w:color w:val="E2E8F0"/>
                 <w:sz w:val="19"/>
               </w:rPr>
-              <w:t>Kurikulum Merdeka • PKBM Penerus Bangsa • Tahun Ajaran 2026/2027</w:t>
+              <w:t>Kurikulum Merdeka • PKBM Penerus Bangsa • Pendekatan Storytelling &amp; Analogi Objek Nyata</w:t>
               <w:br/>
               <w:t>Khusus Disalin Rapi ke Buku Tulis Siswa saat Sesi Zoom Online</w:t>
             </w:r>
@@ -110,7 +110,7 @@
                 <w:color w:val="0369A1"/>
                 <w:sz w:val="20"/>
               </w:rPr>
-              <w:t>• 1. JARGON EMAS: 'SEGITIGA EMAS BALIGH'</w:t>
+              <w:t>• 1. Makna Baligh &amp; Analogi 'Lisensi Nahkoda Sendiri':</w:t>
               <w:br/>
             </w:r>
             <w:r>
@@ -120,7 +120,7 @@
                 <w:i w:val="0"/>
                 <w:sz w:val="19"/>
               </w:rPr>
-              <w:t xml:space="preserve">   Baligh artinya sampai (kedewasaan). Tiga pilar ksatria baligh:</w:t>
+              <w:t xml:space="preserve">   - Baligh secara bahasa berarti sampai (telah sampai pada usia kedewasaan).</w:t>
               <w:br/>
             </w:r>
             <w:r>
@@ -130,7 +130,7 @@
                 <w:i w:val="0"/>
                 <w:sz w:val="19"/>
               </w:rPr>
-              <w:t xml:space="preserve">   - Pilar 1 (Biologi - Tubuh): </w:t>
+              <w:t xml:space="preserve">   - Status Mukallaf: </w:t>
             </w:r>
             <w:r>
               <w:rPr>
@@ -139,7 +139,7 @@
                 <w:i w:val="0"/>
                 <w:sz w:val="19"/>
               </w:rPr>
-              <w:t>Tubuh tegap kekar, suara membesar berat, jakun tumbuh, dan kelenjar keringat bertambah aktif.</w:t>
+              <w:t>Dulu ibadahnya disetir orang tua, sekarang Aqlan resmi memegang kemudi sendiri di hadapan Allah. Wajib mendirikan salat 5 waktu mandiri tanpa disuruh-suruh.</w:t>
               <w:br/>
             </w:r>
             <w:r>
@@ -149,7 +149,7 @@
                 <w:i w:val="0"/>
                 <w:sz w:val="19"/>
               </w:rPr>
-              <w:t xml:space="preserve">   - Pilar 2 (Fikih - Tanda Sah): </w:t>
+              <w:t xml:space="preserve">   - Buku Rekening Amal: </w:t>
             </w:r>
             <w:r>
               <w:rPr>
@@ -158,26 +158,7 @@
                 <w:i w:val="0"/>
                 <w:sz w:val="19"/>
               </w:rPr>
-              <w:t>Mengalami mimpi basah (ihtilam) saat tidur, atau telah genap berusia 15 tahun.</w:t>
-              <w:br/>
-            </w:r>
-            <w:r>
-              <w:rPr>
-                <w:rFonts w:ascii="Calibri" w:hAnsi="Calibri"/>
-                <w:b/>
-                <w:i w:val="0"/>
-                <w:sz w:val="19"/>
-              </w:rPr>
-              <w:t xml:space="preserve">   - Pilar 3 (Syariat - Mukallaf): </w:t>
-            </w:r>
-            <w:r>
-              <w:rPr>
-                <w:rFonts w:ascii="Calibri" w:hAnsi="Calibri"/>
-                <w:b w:val="0"/>
-                <w:i w:val="0"/>
-                <w:sz w:val="19"/>
-              </w:rPr>
-              <w:t>Wajib mendirikan salat fardhu 5 waktu mandiri atas tanggung jawab sendiri.</w:t>
+              <w:t>Malaikat Raqib mencatat kebaikan, Malaikat Atid mencatat kekhilafan. Aqlan bertanggung jawab penuh atas amalnya sendiri.</w:t>
               <w:br/>
               <w:br/>
             </w:r>
@@ -189,7 +170,57 @@
                 <w:color w:val="0369A1"/>
                 <w:sz w:val="20"/>
               </w:rPr>
-              <w:t>• 2. JARGON EMAS: 'FORMULA 2-R MANDI WAJIB'</w:t>
+              <w:t>• 2. Tanda-Tanda Baligh: Sains Biologi &amp; Syariat Fikih:</w:t>
+              <w:br/>
+            </w:r>
+            <w:r>
+              <w:rPr>
+                <w:rFonts w:ascii="Calibri" w:hAnsi="Calibri"/>
+                <w:b/>
+                <w:i w:val="0"/>
+                <w:sz w:val="19"/>
+              </w:rPr>
+              <w:t xml:space="preserve">   - Perubahan Fisik (Biologi): </w:t>
+            </w:r>
+            <w:r>
+              <w:rPr>
+                <w:rFonts w:ascii="Calibri" w:hAnsi="Calibri"/>
+                <w:b w:val="0"/>
+                <w:i w:val="0"/>
+                <w:sz w:val="19"/>
+              </w:rPr>
+              <w:t>Suara bertambah berat, jakun tumbuh di leher, dada bidang kekar, dan kelenjar keringat bertambah aktif.</w:t>
+              <w:br/>
+            </w:r>
+            <w:r>
+              <w:rPr>
+                <w:rFonts w:ascii="Calibri" w:hAnsi="Calibri"/>
+                <w:b/>
+                <w:i w:val="0"/>
+                <w:sz w:val="19"/>
+              </w:rPr>
+              <w:t xml:space="preserve">   - Tanda Sah Kedewasaan (Fikih): </w:t>
+            </w:r>
+            <w:r>
+              <w:rPr>
+                <w:rFonts w:ascii="Calibri" w:hAnsi="Calibri"/>
+                <w:b w:val="0"/>
+                <w:i w:val="0"/>
+                <w:sz w:val="19"/>
+              </w:rPr>
+              <w:t>Mengalami mimpi basah (ihtilam) saat tidur, atau telah genap berusia 15 tahun.</w:t>
+              <w:br/>
+              <w:br/>
+            </w:r>
+            <w:r>
+              <w:rPr>
+                <w:rFonts w:ascii="Calibri" w:hAnsi="Calibri"/>
+                <w:b/>
+                <w:i w:val="0"/>
+                <w:color w:val="0369A1"/>
+                <w:sz w:val="20"/>
+              </w:rPr>
+              <w:t>• 3. Bersuci dari Hadas Besar: Analogi 'Cuci Bersih Total' (Mandi Wajib):</w:t>
               <w:br/>
             </w:r>
             <w:r>
@@ -205,20 +236,11 @@
             <w:r>
               <w:rPr>
                 <w:rFonts w:ascii="Calibri" w:hAnsi="Calibri"/>
-                <w:b/>
-                <w:i w:val="0"/>
-                <w:sz w:val="19"/>
-              </w:rPr>
-              <w:t xml:space="preserve">   - R1 = R-asa Niat di Hati: </w:t>
-            </w:r>
-            <w:r>
-              <w:rPr>
-                <w:rFonts w:ascii="Calibri" w:hAnsi="Calibri"/>
                 <w:b w:val="0"/>
                 <w:i/>
                 <w:sz w:val="19"/>
               </w:rPr>
-              <w:t>"Nawaitul ghusla liraf'il hadatsil akbari fardhan lillaahi ta'aala" (Niat ikhlas bersuci karena Allah Ta'ala).</w:t>
+              <w:t xml:space="preserve">   Seperti mencuci papan skate berlumpur: harus dibasuh menyeluruh tanpa celah kering.</w:t>
               <w:br/>
             </w:r>
             <w:r>
@@ -228,28 +250,16 @@
                 <w:i w:val="0"/>
                 <w:sz w:val="19"/>
               </w:rPr>
-              <w:t xml:space="preserve">   - R2 = R-atakan Air Menyeluruh: </w:t>
+              <w:t xml:space="preserve">   - Kunci 1 (Niat di Dalam Hati): </w:t>
             </w:r>
             <w:r>
               <w:rPr>
                 <w:rFonts w:ascii="Calibri" w:hAnsi="Calibri"/>
                 <w:b w:val="0"/>
-                <w:i w:val="0"/>
+                <w:i/>
                 <w:sz w:val="19"/>
               </w:rPr>
-              <w:t>Membasuh dan mengguyur air suci merata dari ujung rambut kepala hingga sela-sela jari kaki tanpa ada bagian kering terlewat!</w:t>
-              <w:br/>
-              <w:br/>
-            </w:r>
-            <w:r>
-              <w:rPr>
-                <w:rFonts w:ascii="Calibri" w:hAnsi="Calibri"/>
-                <w:b/>
-                <w:i w:val="0"/>
-                <w:color w:val="0369A1"/>
-                <w:sz w:val="20"/>
-              </w:rPr>
-              <w:t>• 3. JARGON EMAS: 'KEMUDI DUA RADAR MALAIKAT'</w:t>
+              <w:t>"Nawaitul ghusla liraf'il hadatsil akbari fardhan lillaahi ta'aala" (Niat bersuci karena Allah Ta'ala).</w:t>
               <w:br/>
             </w:r>
             <w:r>
@@ -259,7 +269,7 @@
                 <w:i w:val="0"/>
                 <w:sz w:val="19"/>
               </w:rPr>
-              <w:t xml:space="preserve">   - Radar Kanan (Malaikat Raqib): </w:t>
+              <w:t xml:space="preserve">   - Kunci 2 (Siram dan Ratakan Air Menyeluruh): </w:t>
             </w:r>
             <w:r>
               <w:rPr>
@@ -268,26 +278,8 @@
                 <w:i w:val="0"/>
                 <w:sz w:val="19"/>
               </w:rPr>
-              <w:t>Mencatat setiap amal kebaikan, kejujuran, dan salat tepat waktu.</w:t>
+              <w:t>Mengguyur air suci merata dari ujung helai rambut kepala sampai sela-sela jari telapak kaki!</w:t>
               <w:br/>
-            </w:r>
-            <w:r>
-              <w:rPr>
-                <w:rFonts w:ascii="Calibri" w:hAnsi="Calibri"/>
-                <w:b/>
-                <w:i w:val="0"/>
-                <w:sz w:val="19"/>
-              </w:rPr>
-              <w:t xml:space="preserve">   - Radar Kiri (Malaikat Atid): </w:t>
-            </w:r>
-            <w:r>
-              <w:rPr>
-                <w:rFonts w:ascii="Calibri" w:hAnsi="Calibri"/>
-                <w:b w:val="0"/>
-                <w:i w:val="0"/>
-                <w:sz w:val="19"/>
-              </w:rPr>
-              <w:t>Mencatat setiap perbuatan lalai atau salah.</w:t>
               <w:br/>
             </w:r>
             <w:r>
@@ -308,7 +300,7 @@
                 <w:color w:val="B45309"/>
                 <w:sz w:val="19"/>
               </w:rPr>
-              <w:t>"Ksatria sejati memegang kemudi hidupnya sendiri. Pastikan radar kebaikanmu selalu menyala terang di hadapan Allah!"</w:t>
+              <w:t>"Seorang ksatria muslim menjaga kebersihan raga dan keteguhan iman. Pegang kemudimu sendiri menuju rida Allah Swt.!"</w:t>
               <w:br/>
             </w:r>
           </w:p>
@@ -363,17 +355,7 @@
                 <w:color w:val="047857"/>
                 <w:sz w:val="20"/>
               </w:rPr>
-              <w:t>• 1. JARGON EMAS: 'KOMPAS 4-PINTU BERBAGI (Z-I-S-H)'</w:t>
-              <w:br/>
-            </w:r>
-            <w:r>
-              <w:rPr>
-                <w:rFonts w:ascii="Calibri" w:hAnsi="Calibri"/>
-                <w:b w:val="0"/>
-                <w:i w:val="0"/>
-                <w:sz w:val="19"/>
-              </w:rPr>
-              <w:t xml:space="preserve">   Empat pintu rezeki mulia dalam Islam yang tidak boleh tertukar:</w:t>
+              <w:t>• 1. Membedakan Bentuk Berbagi: Analogi 'Empat Cabang Pohon Kebaikan':</w:t>
               <w:br/>
             </w:r>
             <w:r>
@@ -383,7 +365,7 @@
                 <w:i w:val="0"/>
                 <w:sz w:val="19"/>
               </w:rPr>
-              <w:t xml:space="preserve">   - 🔒 ZAKAT = Pintu Gembok (Wajib &amp; Ada Takaran): </w:t>
+              <w:t xml:space="preserve">   - 🌳 Akar Kokoh = Zakat (Wajib &amp; Terukur): </w:t>
             </w:r>
             <w:r>
               <w:rPr>
@@ -392,7 +374,7 @@
                 <w:i w:val="0"/>
                 <w:sz w:val="19"/>
               </w:rPr>
-              <w:t>Hukumnya wajib bagi yang mampu. Ada syarat Nisab (takaran minimal) dan Haul (milik genap 1 tahun) khusus untuk 8 asnaf.</w:t>
+              <w:t>Fondasi wajib penopang pohon bagi yang mampu. Ada takaran minimal (Nisab) dan waktu setahun (Haul) khusus untuk 8 golongan mustahik.</w:t>
               <w:br/>
             </w:r>
             <w:r>
@@ -402,7 +384,7 @@
                 <w:i w:val="0"/>
                 <w:sz w:val="19"/>
               </w:rPr>
-              <w:t xml:space="preserve">   - 🚿 INFAK = Pintu Keran Harta (Uang Sukarela Kapan Saja): </w:t>
+              <w:t xml:space="preserve">   - 🪵 Batang Utama = Infak (Uang Sukarela di Jalan Kebaikan): </w:t>
             </w:r>
             <w:r>
               <w:rPr>
@@ -411,7 +393,7 @@
                 <w:i w:val="0"/>
                 <w:sz w:val="19"/>
               </w:rPr>
-              <w:t>Mengeluarkan materi/uang sukarela di jalan Allah (kotak amal masjid, bencana) tanpa syarat nisab dan bebas waktu.</w:t>
+              <w:t>Mengalirkan harta/uang sukarela untuk sarana umum (masjid, sekolah, bencana) kapan saja tanpa batasan nisab.</w:t>
               <w:br/>
             </w:r>
             <w:r>
@@ -421,7 +403,7 @@
                 <w:i w:val="0"/>
                 <w:sz w:val="19"/>
               </w:rPr>
-              <w:t xml:space="preserve">   - ☀️ SEDEKAH = Pintu Senyum Semesta (Kebaikan Segala Hal): </w:t>
+              <w:t xml:space="preserve">   - 🍃 Ranting &amp; Daun Rimbun = Sedekah (Kebaikan Segala Hal Tanpa Batas): </w:t>
             </w:r>
             <w:r>
               <w:rPr>
@@ -430,7 +412,7 @@
                 <w:i w:val="0"/>
                 <w:sz w:val="19"/>
               </w:rPr>
-              <w:t>Paling luas! Tidak butuh uang: senyuman tulus, tutur kata santun, singkirkan duri di jalan, dan tenaga adalah sedekah emas.</w:t>
+              <w:t>Paling luas menaungi siapa saja! Tidak harus punya uang: senyuman tulus, tutur kata santun, dan menyingkirkan duri di jalan adalah sedekah emas.</w:t>
               <w:br/>
             </w:r>
             <w:r>
@@ -440,7 +422,7 @@
                 <w:i w:val="0"/>
                 <w:sz w:val="19"/>
               </w:rPr>
-              <w:t xml:space="preserve">   - 🎁 HADIAH = Pintu Kasih Sayang (Apresiasi Persahabatan): </w:t>
+              <w:t xml:space="preserve">   - 🌸 Bunga Semerbak = Hadiah (Tanda Kasih Persahabatan): </w:t>
             </w:r>
             <w:r>
               <w:rPr>
@@ -449,7 +431,7 @@
                 <w:i w:val="0"/>
                 <w:sz w:val="19"/>
               </w:rPr>
-              <w:t>Kado sukarela untuk memuliakan sahabat, guru, atau keluarga sebagai tanda cinta kasih (Tahadu Tahabbu).</w:t>
+              <w:t>Kado manis sukarela untuk memuliakan sahabat, guru, atau keluarga demi merekatkan cinta kasih (Tahadu Tahabbu), bukan karena penerima miskin.</w:t>
               <w:br/>
               <w:br/>
             </w:r>
@@ -461,7 +443,17 @@
                 <w:color w:val="047857"/>
                 <w:sz w:val="20"/>
               </w:rPr>
-              <w:t>• 2. JARGON EMAS: 'DUA RACUN PAHALA: M-A' (Q.S. Al-Baqarah: 264)</w:t>
+              <w:t>• 2. Perusak Pahala Berbagi: Analogi 'Batu Licin Tersapu Badai' (Q.S. Al-Baqarah: 264):</w:t>
+              <w:br/>
+            </w:r>
+            <w:r>
+              <w:rPr>
+                <w:rFonts w:ascii="Calibri" w:hAnsi="Calibri"/>
+                <w:b w:val="0"/>
+                <w:i w:val="0"/>
+                <w:sz w:val="19"/>
+              </w:rPr>
+              <w:t xml:space="preserve">   Pahala bisa hilang licin tanpa bekas seperti debu tersapu badai jika terkena dua sifat:</w:t>
               <w:br/>
             </w:r>
             <w:r>
@@ -471,7 +463,7 @@
                 <w:i w:val="0"/>
                 <w:sz w:val="19"/>
               </w:rPr>
-              <w:t xml:space="preserve">   - 🚫 M = Mengungkit-ungkit (Al-Mann): </w:t>
+              <w:t xml:space="preserve">   - Mengungkit-ungkit (Al-Mann): </w:t>
             </w:r>
             <w:r>
               <w:rPr>
@@ -480,7 +472,7 @@
                 <w:i w:val="0"/>
                 <w:sz w:val="19"/>
               </w:rPr>
-              <w:t>Mengingat-ingat jasa sendiri di depan orang lain ("Kan kemarin aku yang bayarin!").</w:t>
+              <w:t>Menyebut-nyebut jasa sendiri di hadapan orang lain ("Kan kemarin aku yang bayarin!").</w:t>
               <w:br/>
             </w:r>
             <w:r>
@@ -490,7 +482,7 @@
                 <w:i w:val="0"/>
                 <w:sz w:val="19"/>
               </w:rPr>
-              <w:t xml:space="preserve">   - 🚫 A = Amarah / Sakiti Hati (Al-Adza): </w:t>
+              <w:t xml:space="preserve">   - Menyakiti Hati Penerima (Al-Adza): </w:t>
             </w:r>
             <w:r>
               <w:rPr>
@@ -499,7 +491,7 @@
                 <w:i w:val="0"/>
                 <w:sz w:val="19"/>
               </w:rPr>
-              <w:t>Meremehkan, membentak, atau mempermalukan martabat orang yang dibantu.</w:t>
+              <w:t>Meremehkan, menyindir, atau mempermalukan perasaan orang yang kita bantu.</w:t>
               <w:br/>
               <w:br/>
             </w:r>
@@ -511,7 +503,7 @@
                 <w:color w:val="047857"/>
                 <w:sz w:val="20"/>
               </w:rPr>
-              <w:t>• 3. JARGON EMAS: 'SEGITIGA EMAS TANGAN DI ATAS'</w:t>
+              <w:t>• 3. Keanggunan 'Tangan di Atas' (Adab Luhur Berbagi):</w:t>
               <w:br/>
             </w:r>
             <w:r>
@@ -521,7 +513,7 @@
                 <w:i w:val="0"/>
                 <w:sz w:val="19"/>
               </w:rPr>
-              <w:t xml:space="preserve">   1. Ikhlas Tanpa Kamera (Anti-Riya'): Memberi semata-mata mengharap ridha Allah Swt.</w:t>
+              <w:t xml:space="preserve">   - Ikhlas Tanpa Kamera (Anti-Riya'): Memberi semata-mata mencari rida Allah, bukan demi pujian medsos.</w:t>
               <w:br/>
             </w:r>
             <w:r>
@@ -531,7 +523,7 @@
                 <w:i w:val="0"/>
                 <w:sz w:val="19"/>
               </w:rPr>
-              <w:t xml:space="preserve">   2. Rahasia Tangan Kanan: "Tangan kanan memberi, tangan kiri tidak tahu" (sangat rahasia &amp; elegan).</w:t>
+              <w:t xml:space="preserve">   - Kerahasiaan Tangan Kanan: "Tangan kanan memberi, tangan kiri tidak tahu". Sangat anggun dan bersahaja.</w:t>
               <w:br/>
             </w:r>
             <w:r>
@@ -541,7 +533,8 @@
                 <w:i w:val="0"/>
                 <w:sz w:val="19"/>
               </w:rPr>
-              <w:t xml:space="preserve">   3. Muliakan Martabat Sahabat: Memberi dengan senyum santun dan menjaga kehormatan penerima.</w:t>
+              <w:t xml:space="preserve">   - Menjaga Martabat Sahabat: Memberi dengan senyum hangat dan memuliakan penerima.</w:t>
+              <w:br/>
               <w:br/>
             </w:r>
             <w:r>
@@ -562,7 +555,7 @@
                 <w:color w:val="065F46"/>
                 <w:sz w:val="19"/>
               </w:rPr>
-              <w:t>"Tangan di atas jauh lebih mulia daripada tangan di bawah. Harta tidak pernah berkurang karena sedekah, justru melipatgandakan kedamaian jiwa!"</w:t>
+              <w:t>"Seperti keanggunan gerakan senam lantai yang tenang dan memukau, kemuliaan berbagi terpancar dari ketulusan hati yang tidak mencari tepuk tangan manusia!"</w:t>
               <w:br/>
             </w:r>
           </w:p>

</xml_diff>

<commit_message>
feat(pai): add video visuals (Aqlan skatepark, Mishka garden, Sakura tree of kindness), shorten notes with textbook terms
</commit_message>
<xml_diff>
--- a/docs/Catatan_Belajar_Siswa_PAI_Bab4.docx
+++ b/docs/Catatan_Belajar_Siswa_PAI_Bab4.docx
@@ -17,10 +17,10 @@
             <w:tcW w:type="dxa" w:w="9792"/>
             <w:shd w:fill="047857"/>
             <w:tcMar>
-              <w:top w:w="180" w:type="dxa"/>
-              <w:bottom w:w="180" w:type="dxa"/>
-              <w:left w:w="220" w:type="dxa"/>
-              <w:right w:w="220" w:type="dxa"/>
+              <w:top w:w="160" w:type="dxa"/>
+              <w:bottom w:w="160" w:type="dxa"/>
+              <w:left w:w="200" w:type="dxa"/>
+              <w:right w:w="200" w:type="dxa"/>
             </w:tcMar>
           </w:tcPr>
           <w:p>
@@ -54,9 +54,9 @@
                 <w:color w:val="E2E8F0"/>
                 <w:sz w:val="19"/>
               </w:rPr>
-              <w:t>Kurikulum Merdeka • PKBM Penerus Bangsa • Pendekatan Storytelling &amp; Analogi Objek Nyata</w:t>
+              <w:t>Kurikulum Merdeka • PKBM Penerus Bangsa</w:t>
               <w:br/>
-              <w:t>Khusus Disalin Rapi ke Buku Tulis Siswa saat Sesi Zoom Online</w:t>
+              <w:t>Catatan Singkat Berbasis Textbook Kemendikbud (Mudah &amp; Cepat Disalin)</w:t>
             </w:r>
           </w:p>
         </w:tc>
@@ -82,8 +82,8 @@
             <w:tcW w:type="dxa" w:w="9792"/>
             <w:shd w:fill="F0F9FF"/>
             <w:tcMar>
-              <w:top w:w="130" w:type="dxa"/>
-              <w:bottom w:w="130" w:type="dxa"/>
+              <w:top w:w="120" w:type="dxa"/>
+              <w:bottom w:w="120" w:type="dxa"/>
               <w:left w:w="180" w:type="dxa"/>
               <w:right w:w="180" w:type="dxa"/>
             </w:tcMar>
@@ -99,7 +99,7 @@
                 <w:color w:val="0369A1"/>
                 <w:sz w:val="21"/>
               </w:rPr>
-              <w:t>📘 BAGIAN 1: CATATAN BUKU TULIS AQLAN (KELAS 4) • BAB 4: MENYAMBUT USIA BALIGH</w:t>
+              <w:t>📘 SESI 1: AQLAN (KELAS 4 SD) • BAB 4: MENYAMBUT USIA BALIGH</w:t>
               <w:br/>
             </w:r>
             <w:r>
@@ -107,10 +107,112 @@
                 <w:rFonts w:ascii="Calibri" w:hAnsi="Calibri"/>
                 <w:b/>
                 <w:i w:val="0"/>
-                <w:color w:val="0369A1"/>
-                <w:sz w:val="20"/>
+                <w:sz w:val="19"/>
               </w:rPr>
-              <w:t>• 1. Makna Baligh &amp; Analogi 'Lisensi Nahkoda Sendiri':</w:t>
+              <w:t xml:space="preserve">• 1. Pengertian Baligh: </w:t>
+            </w:r>
+            <w:r>
+              <w:rPr>
+                <w:rFonts w:ascii="Calibri" w:hAnsi="Calibri"/>
+                <w:b w:val="0"/>
+                <w:i w:val="0"/>
+                <w:sz w:val="19"/>
+              </w:rPr>
+              <w:t xml:space="preserve">Menurut bahasa artinya "sampai". Menurut istilah, baligh adalah masa kedewasaan seseorang yang menandai bahwa ia telah menjadi seorang </w:t>
+            </w:r>
+            <w:r>
+              <w:rPr>
+                <w:rFonts w:ascii="Calibri" w:hAnsi="Calibri"/>
+                <w:b/>
+                <w:i w:val="0"/>
+                <w:sz w:val="19"/>
+              </w:rPr>
+              <w:t>mukallaf</w:t>
+            </w:r>
+            <w:r>
+              <w:rPr>
+                <w:rFonts w:ascii="Calibri" w:hAnsi="Calibri"/>
+                <w:b w:val="0"/>
+                <w:i w:val="0"/>
+                <w:sz w:val="19"/>
+              </w:rPr>
+              <w:t xml:space="preserve"> (wajib menjalankan syariat Islam secara mandiri).</w:t>
+              <w:br/>
+            </w:r>
+            <w:r>
+              <w:rPr>
+                <w:rFonts w:ascii="Calibri" w:hAnsi="Calibri"/>
+                <w:b/>
+                <w:i w:val="0"/>
+                <w:sz w:val="19"/>
+              </w:rPr>
+              <w:t>• 2. Tanda-Tanda Baligh:</w:t>
+              <w:br/>
+            </w:r>
+            <w:r>
+              <w:rPr>
+                <w:rFonts w:ascii="Calibri" w:hAnsi="Calibri"/>
+                <w:b/>
+                <w:i w:val="0"/>
+                <w:sz w:val="19"/>
+              </w:rPr>
+              <w:t xml:space="preserve">   - Ilmu Biologi (Fisik): </w:t>
+            </w:r>
+            <w:r>
+              <w:rPr>
+                <w:rFonts w:ascii="Calibri" w:hAnsi="Calibri"/>
+                <w:b w:val="0"/>
+                <w:i w:val="0"/>
+                <w:sz w:val="19"/>
+              </w:rPr>
+              <w:t>Suara bertambah berat/dalam, tumbuh jakun di leher, dada membidang, serta kelenjar keringat bertambah aktif.</w:t>
+              <w:br/>
+            </w:r>
+            <w:r>
+              <w:rPr>
+                <w:rFonts w:ascii="Calibri" w:hAnsi="Calibri"/>
+                <w:b/>
+                <w:i w:val="0"/>
+                <w:sz w:val="19"/>
+              </w:rPr>
+              <w:t xml:space="preserve">   - Ilmu Fikih: </w:t>
+            </w:r>
+            <w:r>
+              <w:rPr>
+                <w:rFonts w:ascii="Calibri" w:hAnsi="Calibri"/>
+                <w:b w:val="0"/>
+                <w:i w:val="0"/>
+                <w:sz w:val="19"/>
+              </w:rPr>
+              <w:t>Mengalami mimpi basah (ihtilam) bagi laki-laki, atau telah mencapai batas usia 15 tahun (hijriyah/masehi).</w:t>
+              <w:br/>
+            </w:r>
+            <w:r>
+              <w:rPr>
+                <w:rFonts w:ascii="Calibri" w:hAnsi="Calibri"/>
+                <w:b/>
+                <w:i w:val="0"/>
+                <w:sz w:val="19"/>
+              </w:rPr>
+              <w:t xml:space="preserve">• 3. Mandi Wajib (Ghusl): </w:t>
+            </w:r>
+            <w:r>
+              <w:rPr>
+                <w:rFonts w:ascii="Calibri" w:hAnsi="Calibri"/>
+                <w:b w:val="0"/>
+                <w:i w:val="0"/>
+                <w:sz w:val="19"/>
+              </w:rPr>
+              <w:t xml:space="preserve">Cara bersuci untuk menghilangkan hadas besar (mimpi basah). </w:t>
+            </w:r>
+            <w:r>
+              <w:rPr>
+                <w:rFonts w:ascii="Calibri" w:hAnsi="Calibri"/>
+                <w:b/>
+                <w:i w:val="0"/>
+                <w:sz w:val="19"/>
+              </w:rPr>
+              <w:t>Dua Rukun Sah Mandi Wajib:</w:t>
               <w:br/>
             </w:r>
             <w:r>
@@ -120,7 +222,17 @@
                 <w:i w:val="0"/>
                 <w:sz w:val="19"/>
               </w:rPr>
-              <w:t xml:space="preserve">   - Baligh secara bahasa berarti sampai (telah sampai pada usia kedewasaan).</w:t>
+              <w:t xml:space="preserve">   a) Niat menghilangkan hadas besar karena Allah Ta'ala di dalam hati.</w:t>
+              <w:br/>
+            </w:r>
+            <w:r>
+              <w:rPr>
+                <w:rFonts w:ascii="Calibri" w:hAnsi="Calibri"/>
+                <w:b w:val="0"/>
+                <w:i w:val="0"/>
+                <w:sz w:val="19"/>
+              </w:rPr>
+              <w:t xml:space="preserve">   b) Meratakan air suci ke seluruh tubuh dari ujung rambut hingga telapak kaki.</w:t>
               <w:br/>
             </w:r>
             <w:r>
@@ -130,7 +242,7 @@
                 <w:i w:val="0"/>
                 <w:sz w:val="19"/>
               </w:rPr>
-              <w:t xml:space="preserve">   - Status Mukallaf: </w:t>
+              <w:t xml:space="preserve">• 4. Kewajiban Setelah Baligh: </w:t>
             </w:r>
             <w:r>
               <w:rPr>
@@ -139,146 +251,7 @@
                 <w:i w:val="0"/>
                 <w:sz w:val="19"/>
               </w:rPr>
-              <w:t>Dulu ibadahnya disetir orang tua, sekarang Aqlan resmi memegang kemudi sendiri di hadapan Allah. Wajib mendirikan salat 5 waktu mandiri tanpa disuruh-suruh.</w:t>
-              <w:br/>
-            </w:r>
-            <w:r>
-              <w:rPr>
-                <w:rFonts w:ascii="Calibri" w:hAnsi="Calibri"/>
-                <w:b/>
-                <w:i w:val="0"/>
-                <w:sz w:val="19"/>
-              </w:rPr>
-              <w:t xml:space="preserve">   - Buku Rekening Amal: </w:t>
-            </w:r>
-            <w:r>
-              <w:rPr>
-                <w:rFonts w:ascii="Calibri" w:hAnsi="Calibri"/>
-                <w:b w:val="0"/>
-                <w:i w:val="0"/>
-                <w:sz w:val="19"/>
-              </w:rPr>
-              <w:t>Malaikat Raqib mencatat kebaikan, Malaikat Atid mencatat kekhilafan. Aqlan bertanggung jawab penuh atas amalnya sendiri.</w:t>
-              <w:br/>
-              <w:br/>
-            </w:r>
-            <w:r>
-              <w:rPr>
-                <w:rFonts w:ascii="Calibri" w:hAnsi="Calibri"/>
-                <w:b/>
-                <w:i w:val="0"/>
-                <w:color w:val="0369A1"/>
-                <w:sz w:val="20"/>
-              </w:rPr>
-              <w:t>• 2. Tanda-Tanda Baligh: Sains Biologi &amp; Syariat Fikih:</w:t>
-              <w:br/>
-            </w:r>
-            <w:r>
-              <w:rPr>
-                <w:rFonts w:ascii="Calibri" w:hAnsi="Calibri"/>
-                <w:b/>
-                <w:i w:val="0"/>
-                <w:sz w:val="19"/>
-              </w:rPr>
-              <w:t xml:space="preserve">   - Perubahan Fisik (Biologi): </w:t>
-            </w:r>
-            <w:r>
-              <w:rPr>
-                <w:rFonts w:ascii="Calibri" w:hAnsi="Calibri"/>
-                <w:b w:val="0"/>
-                <w:i w:val="0"/>
-                <w:sz w:val="19"/>
-              </w:rPr>
-              <w:t>Suara bertambah berat, jakun tumbuh di leher, dada bidang kekar, dan kelenjar keringat bertambah aktif.</w:t>
-              <w:br/>
-            </w:r>
-            <w:r>
-              <w:rPr>
-                <w:rFonts w:ascii="Calibri" w:hAnsi="Calibri"/>
-                <w:b/>
-                <w:i w:val="0"/>
-                <w:sz w:val="19"/>
-              </w:rPr>
-              <w:t xml:space="preserve">   - Tanda Sah Kedewasaan (Fikih): </w:t>
-            </w:r>
-            <w:r>
-              <w:rPr>
-                <w:rFonts w:ascii="Calibri" w:hAnsi="Calibri"/>
-                <w:b w:val="0"/>
-                <w:i w:val="0"/>
-                <w:sz w:val="19"/>
-              </w:rPr>
-              <w:t>Mengalami mimpi basah (ihtilam) saat tidur, atau telah genap berusia 15 tahun.</w:t>
-              <w:br/>
-              <w:br/>
-            </w:r>
-            <w:r>
-              <w:rPr>
-                <w:rFonts w:ascii="Calibri" w:hAnsi="Calibri"/>
-                <w:b/>
-                <w:i w:val="0"/>
-                <w:color w:val="0369A1"/>
-                <w:sz w:val="20"/>
-              </w:rPr>
-              <w:t>• 3. Bersuci dari Hadas Besar: Analogi 'Cuci Bersih Total' (Mandi Wajib):</w:t>
-              <w:br/>
-            </w:r>
-            <w:r>
-              <w:rPr>
-                <w:rFonts w:ascii="Calibri" w:hAnsi="Calibri"/>
-                <w:b w:val="0"/>
-                <w:i w:val="0"/>
-                <w:sz w:val="19"/>
-              </w:rPr>
-              <w:t xml:space="preserve">   Mimpi basah berstatus Hadas Besar (Junub). Sebelum mandi wajib, tidak sah salat dan tidak boleh pegang Al-Qur'an.</w:t>
-              <w:br/>
-            </w:r>
-            <w:r>
-              <w:rPr>
-                <w:rFonts w:ascii="Calibri" w:hAnsi="Calibri"/>
-                <w:b w:val="0"/>
-                <w:i/>
-                <w:sz w:val="19"/>
-              </w:rPr>
-              <w:t xml:space="preserve">   Seperti mencuci papan skate berlumpur: harus dibasuh menyeluruh tanpa celah kering.</w:t>
-              <w:br/>
-            </w:r>
-            <w:r>
-              <w:rPr>
-                <w:rFonts w:ascii="Calibri" w:hAnsi="Calibri"/>
-                <w:b/>
-                <w:i w:val="0"/>
-                <w:sz w:val="19"/>
-              </w:rPr>
-              <w:t xml:space="preserve">   - Kunci 1 (Niat di Dalam Hati): </w:t>
-            </w:r>
-            <w:r>
-              <w:rPr>
-                <w:rFonts w:ascii="Calibri" w:hAnsi="Calibri"/>
-                <w:b w:val="0"/>
-                <w:i/>
-                <w:sz w:val="19"/>
-              </w:rPr>
-              <w:t>"Nawaitul ghusla liraf'il hadatsil akbari fardhan lillaahi ta'aala" (Niat bersuci karena Allah Ta'ala).</w:t>
-              <w:br/>
-            </w:r>
-            <w:r>
-              <w:rPr>
-                <w:rFonts w:ascii="Calibri" w:hAnsi="Calibri"/>
-                <w:b/>
-                <w:i w:val="0"/>
-                <w:sz w:val="19"/>
-              </w:rPr>
-              <w:t xml:space="preserve">   - Kunci 2 (Siram dan Ratakan Air Menyeluruh): </w:t>
-            </w:r>
-            <w:r>
-              <w:rPr>
-                <w:rFonts w:ascii="Calibri" w:hAnsi="Calibri"/>
-                <w:b w:val="0"/>
-                <w:i w:val="0"/>
-                <w:sz w:val="19"/>
-              </w:rPr>
-              <w:t>Mengguyur air suci merata dari ujung helai rambut kepala sampai sela-sela jari telapak kaki!</w:t>
+              <w:t>Wajib mendirikan salat fardhu 5 waktu mandiri, menutup aurat laki-laki (antara pusar dan lutut), serta menjaga pergaulan.</w:t>
               <w:br/>
               <w:br/>
             </w:r>
@@ -290,7 +263,7 @@
                 <w:color w:val="B45309"/>
                 <w:sz w:val="19"/>
               </w:rPr>
-              <w:t xml:space="preserve">   💡 Catatan Ksatria: </w:t>
+              <w:t xml:space="preserve">💡 Kunci Ksatria: </w:t>
             </w:r>
             <w:r>
               <w:rPr>
@@ -300,7 +273,7 @@
                 <w:color w:val="B45309"/>
                 <w:sz w:val="19"/>
               </w:rPr>
-              <w:t>"Seorang ksatria muslim menjaga kebersihan raga dan keteguhan iman. Pegang kemudimu sendiri menuju rida Allah Swt.!"</w:t>
+              <w:t>"Baligh berarti siap mandiri. Jaga salat 5 waktu dan kebersihan tubuhmu!"</w:t>
               <w:br/>
             </w:r>
           </w:p>
@@ -327,8 +300,8 @@
             <w:tcW w:type="dxa" w:w="9792"/>
             <w:shd w:fill="ECFDF5"/>
             <w:tcMar>
-              <w:top w:w="130" w:type="dxa"/>
-              <w:bottom w:w="130" w:type="dxa"/>
+              <w:top w:w="120" w:type="dxa"/>
+              <w:bottom w:w="120" w:type="dxa"/>
               <w:left w:w="180" w:type="dxa"/>
               <w:right w:w="180" w:type="dxa"/>
             </w:tcMar>
@@ -344,18 +317,7 @@
                 <w:color w:val="047857"/>
                 <w:sz w:val="21"/>
               </w:rPr>
-              <w:t>📙 BAGIAN 2: CATATAN BUKU TULIS MISHKA (KELAS 5) • BAB 4: HIDUP LAPANG DENGAN BERBAGI</w:t>
-              <w:br/>
-            </w:r>
-            <w:r>
-              <w:rPr>
-                <w:rFonts w:ascii="Calibri" w:hAnsi="Calibri"/>
-                <w:b/>
-                <w:i w:val="0"/>
-                <w:color w:val="047857"/>
-                <w:sz w:val="20"/>
-              </w:rPr>
-              <w:t>• 1. Membedakan Bentuk Berbagi: Analogi 'Empat Cabang Pohon Kebaikan':</w:t>
+              <w:t>📙 SESI 2: MISHKA (KELAS 5 SD) • BAB 4: HIDUP LAPANG DENGAN BERBAGI</w:t>
               <w:br/>
             </w:r>
             <w:r>
@@ -365,16 +327,7 @@
                 <w:i w:val="0"/>
                 <w:sz w:val="19"/>
               </w:rPr>
-              <w:t xml:space="preserve">   - 🌳 Akar Kokoh = Zakat (Wajib &amp; Terukur): </w:t>
-            </w:r>
-            <w:r>
-              <w:rPr>
-                <w:rFonts w:ascii="Calibri" w:hAnsi="Calibri"/>
-                <w:b w:val="0"/>
-                <w:i w:val="0"/>
-                <w:sz w:val="19"/>
-              </w:rPr>
-              <w:t>Fondasi wajib penopang pohon bagi yang mampu. Ada takaran minimal (Nisab) dan waktu setahun (Haul) khusus untuk 8 golongan mustahik.</w:t>
+              <w:t>• 1. Bentuk-Bentuk Berbagi dalam Islam:</w:t>
               <w:br/>
             </w:r>
             <w:r>
@@ -384,7 +337,7 @@
                 <w:i w:val="0"/>
                 <w:sz w:val="19"/>
               </w:rPr>
-              <w:t xml:space="preserve">   - 🪵 Batang Utama = Infak (Uang Sukarela di Jalan Kebaikan): </w:t>
+              <w:t xml:space="preserve">   a) Zakat: </w:t>
             </w:r>
             <w:r>
               <w:rPr>
@@ -393,7 +346,7 @@
                 <w:i w:val="0"/>
                 <w:sz w:val="19"/>
               </w:rPr>
-              <w:t>Mengalirkan harta/uang sukarela untuk sarana umum (masjid, sekolah, bencana) kapan saja tanpa batasan nisab.</w:t>
+              <w:t>Mengeluarkan sebagian harta tertentu yang hukumnya wajib bagi yang mampu dengan takaran tertentu (nisab dan haul) untuk 8 golongan yang berhak (mustahik).</w:t>
               <w:br/>
             </w:r>
             <w:r>
@@ -403,7 +356,7 @@
                 <w:i w:val="0"/>
                 <w:sz w:val="19"/>
               </w:rPr>
-              <w:t xml:space="preserve">   - 🍃 Ranting &amp; Daun Rimbun = Sedekah (Kebaikan Segala Hal Tanpa Batas): </w:t>
+              <w:t xml:space="preserve">   b) Infak: </w:t>
             </w:r>
             <w:r>
               <w:rPr>
@@ -412,7 +365,7 @@
                 <w:i w:val="0"/>
                 <w:sz w:val="19"/>
               </w:rPr>
-              <w:t>Paling luas menaungi siapa saja! Tidak harus punya uang: senyuman tulus, tutur kata santun, dan menyingkirkan duri di jalan adalah sedekah emas.</w:t>
+              <w:t>Mengeluarkan sebagian harta atau uang secara sukarela di jalan Allah untuk kemaslahatan umum tanpa batasan nisab dan waktu.</w:t>
               <w:br/>
             </w:r>
             <w:r>
@@ -422,7 +375,7 @@
                 <w:i w:val="0"/>
                 <w:sz w:val="19"/>
               </w:rPr>
-              <w:t xml:space="preserve">   - 🌸 Bunga Semerbak = Hadiah (Tanda Kasih Persahabatan): </w:t>
+              <w:t xml:space="preserve">   c) Sedekah: </w:t>
             </w:r>
             <w:r>
               <w:rPr>
@@ -431,29 +384,7 @@
                 <w:i w:val="0"/>
                 <w:sz w:val="19"/>
               </w:rPr>
-              <w:t>Kado manis sukarela untuk memuliakan sahabat, guru, atau keluarga demi merekatkan cinta kasih (Tahadu Tahabbu), bukan karena penerima miskin.</w:t>
-              <w:br/>
-              <w:br/>
-            </w:r>
-            <w:r>
-              <w:rPr>
-                <w:rFonts w:ascii="Calibri" w:hAnsi="Calibri"/>
-                <w:b/>
-                <w:i w:val="0"/>
-                <w:color w:val="047857"/>
-                <w:sz w:val="20"/>
-              </w:rPr>
-              <w:t>• 2. Perusak Pahala Berbagi: Analogi 'Batu Licin Tersapu Badai' (Q.S. Al-Baqarah: 264):</w:t>
-              <w:br/>
-            </w:r>
-            <w:r>
-              <w:rPr>
-                <w:rFonts w:ascii="Calibri" w:hAnsi="Calibri"/>
-                <w:b w:val="0"/>
-                <w:i w:val="0"/>
-                <w:sz w:val="19"/>
-              </w:rPr>
-              <w:t xml:space="preserve">   Pahala bisa hilang licin tanpa bekas seperti debu tersapu badai jika terkena dua sifat:</w:t>
+              <w:t>Segala perbuatan baik sukarela semata-mata mencari rida Allah (materi maupun non-materi: senyuman tulus, tutur kata santun, bantuan tenaga).</w:t>
               <w:br/>
             </w:r>
             <w:r>
@@ -463,7 +394,7 @@
                 <w:i w:val="0"/>
                 <w:sz w:val="19"/>
               </w:rPr>
-              <w:t xml:space="preserve">   - Mengungkit-ungkit (Al-Mann): </w:t>
+              <w:t xml:space="preserve">   d) Hadiah: </w:t>
             </w:r>
             <w:r>
               <w:rPr>
@@ -472,7 +403,8 @@
                 <w:i w:val="0"/>
                 <w:sz w:val="19"/>
               </w:rPr>
-              <w:t>Menyebut-nyebut jasa sendiri di hadapan orang lain ("Kan kemarin aku yang bayarin!").</w:t>
+              <w:t>Pemberian barang secara sukarela untuk memuliakan dan mempererat tali persahabatan atau silaturahmi (Tahadu Tahabbu).</w:t>
+              <w:br/>
               <w:br/>
             </w:r>
             <w:r>
@@ -482,7 +414,7 @@
                 <w:i w:val="0"/>
                 <w:sz w:val="19"/>
               </w:rPr>
-              <w:t xml:space="preserve">   - Menyakiti Hati Penerima (Al-Adza): </w:t>
+              <w:t xml:space="preserve">• 2. Larangan dalam Berbagi (Q.S. Al-Baqarah: 264): </w:t>
             </w:r>
             <w:r>
               <w:rPr>
@@ -491,7 +423,43 @@
                 <w:i w:val="0"/>
                 <w:sz w:val="19"/>
               </w:rPr>
-              <w:t>Meremehkan, menyindir, atau mempermalukan perasaan orang yang kita bantu.</w:t>
+              <w:t>Dilarang mengungkit-ungkit pemberian (</w:t>
+            </w:r>
+            <w:r>
+              <w:rPr>
+                <w:rFonts w:ascii="Calibri" w:hAnsi="Calibri"/>
+                <w:b/>
+                <w:i w:val="0"/>
+                <w:sz w:val="19"/>
+              </w:rPr>
+              <w:t>Al-Mann</w:t>
+            </w:r>
+            <w:r>
+              <w:rPr>
+                <w:rFonts w:ascii="Calibri" w:hAnsi="Calibri"/>
+                <w:b w:val="0"/>
+                <w:i w:val="0"/>
+                <w:sz w:val="19"/>
+              </w:rPr>
+              <w:t>) dan dilarang menyakiti perasaan penerima (</w:t>
+            </w:r>
+            <w:r>
+              <w:rPr>
+                <w:rFonts w:ascii="Calibri" w:hAnsi="Calibri"/>
+                <w:b/>
+                <w:i w:val="0"/>
+                <w:sz w:val="19"/>
+              </w:rPr>
+              <w:t>Al-Adza</w:t>
+            </w:r>
+            <w:r>
+              <w:rPr>
+                <w:rFonts w:ascii="Calibri" w:hAnsi="Calibri"/>
+                <w:b w:val="0"/>
+                <w:i w:val="0"/>
+                <w:sz w:val="19"/>
+              </w:rPr>
+              <w:t>) karena dapat menghapus dan membatalkan pahala.</w:t>
               <w:br/>
               <w:br/>
             </w:r>
@@ -500,11 +468,9 @@
                 <w:rFonts w:ascii="Calibri" w:hAnsi="Calibri"/>
                 <w:b/>
                 <w:i w:val="0"/>
-                <w:color w:val="047857"/>
-                <w:sz w:val="20"/>
+                <w:sz w:val="19"/>
               </w:rPr>
-              <w:t>• 3. Keanggunan 'Tangan di Atas' (Adab Luhur Berbagi):</w:t>
-              <w:br/>
+              <w:t xml:space="preserve">• 3. Keutamaan Memberi: </w:t>
             </w:r>
             <w:r>
               <w:rPr>
@@ -513,27 +479,7 @@
                 <w:i w:val="0"/>
                 <w:sz w:val="19"/>
               </w:rPr>
-              <w:t xml:space="preserve">   - Ikhlas Tanpa Kamera (Anti-Riya'): Memberi semata-mata mencari rida Allah, bukan demi pujian medsos.</w:t>
-              <w:br/>
-            </w:r>
-            <w:r>
-              <w:rPr>
-                <w:rFonts w:ascii="Calibri" w:hAnsi="Calibri"/>
-                <w:b w:val="0"/>
-                <w:i w:val="0"/>
-                <w:sz w:val="19"/>
-              </w:rPr>
-              <w:t xml:space="preserve">   - Kerahasiaan Tangan Kanan: "Tangan kanan memberi, tangan kiri tidak tahu". Sangat anggun dan bersahaja.</w:t>
-              <w:br/>
-            </w:r>
-            <w:r>
-              <w:rPr>
-                <w:rFonts w:ascii="Calibri" w:hAnsi="Calibri"/>
-                <w:b w:val="0"/>
-                <w:i w:val="0"/>
-                <w:sz w:val="19"/>
-              </w:rPr>
-              <w:t xml:space="preserve">   - Menjaga Martabat Sahabat: Memberi dengan senyum hangat dan memuliakan penerima.</w:t>
+              <w:t>Memberi dengan ikhlas, menjaga kehormatan penerima, serta mengamalkan prinsip "tangan di atas lebih baik daripada tangan di bawah".</w:t>
               <w:br/>
               <w:br/>
             </w:r>
@@ -545,7 +491,7 @@
                 <w:color w:val="065F46"/>
                 <w:sz w:val="19"/>
               </w:rPr>
-              <w:t xml:space="preserve">   💡 Catatan Ksatria: </w:t>
+              <w:t xml:space="preserve">💡 Kunci Kasih Sayang: </w:t>
             </w:r>
             <w:r>
               <w:rPr>
@@ -555,7 +501,7 @@
                 <w:color w:val="065F46"/>
                 <w:sz w:val="19"/>
               </w:rPr>
-              <w:t>"Seperti keanggunan gerakan senam lantai yang tenang dan memukau, kemuliaan berbagi terpancar dari ketulusan hati yang tidak mencari tepuk tangan manusia!"</w:t>
+              <w:t>"Bersedekah tidak mengurangi harta, melainkan mendatangkan keberkahan jiwa!"</w:t>
               <w:br/>
             </w:r>
           </w:p>

</xml_diff>

<commit_message>
feat(pai): add QS basis for Infaq (QS 3:92) and Sedekah (QS 2:177 / 70:24-25) in student notes without ayat text
</commit_message>
<xml_diff>
--- a/docs/Catatan_Belajar_Siswa_PAI_Bab4.docx
+++ b/docs/Catatan_Belajar_Siswa_PAI_Bab4.docx
@@ -14,36 +14,35 @@
       <w:tr>
         <w:tc>
           <w:tcPr>
-            <w:tcW w:type="dxa" w:w="9792"/>
-            <w:shd w:fill="047857"/>
+            <w:tcW w:type="dxa" w:w="10224"/>
+            <w:shd w:val="clear" w:color="auto" w:fill="047857"/>
             <w:tcMar>
-              <w:top w:w="160" w:type="dxa"/>
-              <w:bottom w:w="160" w:type="dxa"/>
-              <w:left w:w="200" w:type="dxa"/>
-              <w:right w:w="200" w:type="dxa"/>
+              <w:top w:w="240" w:type="dxa"/>
+              <w:bottom w:w="240" w:type="dxa"/>
+              <w:left w:w="260" w:type="dxa"/>
+              <w:right w:w="260" w:type="dxa"/>
             </w:tcMar>
           </w:tcPr>
           <w:p>
             <w:pPr>
-              <w:spacing w:after="40"/>
               <w:jc w:val="center"/>
             </w:pPr>
             <w:r>
               <w:rPr>
                 <w:rFonts w:ascii="Calibri" w:hAnsi="Calibri"/>
                 <w:b/>
-                <w:color w:val="FEF08A"/>
+                <w:color w:val="FDE047"/>
                 <w:sz w:val="20"/>
               </w:rPr>
-              <w:t>⭐ SESI 1: AQLAN (KELAS 4) &amp; SESI 2: MISHKA (KELAS 5) ⭐</w:t>
+              <w:t>★ SESI 1: AQLAN (KELAS 4) &amp; SESI 2: MISHKA (KELAS 5) ★</w:t>
               <w:br/>
             </w:r>
             <w:r>
               <w:rPr>
-                <w:rFonts w:ascii="Arial" w:hAnsi="Arial"/>
+                <w:rFonts w:ascii="Calibri" w:hAnsi="Calibri"/>
                 <w:b/>
                 <w:color w:val="FFFFFF"/>
-                <w:sz w:val="26"/>
+                <w:sz w:val="30"/>
               </w:rPr>
               <w:t>BUKU CATATAN TULIS SISWA • PAI &amp; BUDI PEKERTI BAB 4</w:t>
               <w:br/>
@@ -51,12 +50,13 @@
             <w:r>
               <w:rPr>
                 <w:rFonts w:ascii="Calibri" w:hAnsi="Calibri"/>
+                <w:i/>
                 <w:color w:val="E2E8F0"/>
                 <w:sz w:val="19"/>
               </w:rPr>
-              <w:t>Kurikulum Merdeka • PKBM Penerus Bangsa</w:t>
+              <w:t>Kurikulum Merdeka • PKBM Penerus Bangsa • Catatan Ringkas Ramah Anak</w:t>
               <w:br/>
-              <w:t>Catatan Singkat Berbasis Textbook Kemendikbud (Mudah &amp; Cepat Disalin)</w:t>
+              <w:t>Khusus Disalin Cepat &amp; Rapi ke Buku Tulis saat Sesi Zoom Online</w:t>
             </w:r>
           </w:p>
         </w:tc>
@@ -80,10 +80,10 @@
         <w:tc>
           <w:tcPr>
             <w:tcW w:type="dxa" w:w="9792"/>
-            <w:shd w:fill="F0F9FF"/>
+            <w:shd w:val="clear" w:color="auto" w:fill="F0F9FF"/>
             <w:tcMar>
-              <w:top w:w="120" w:type="dxa"/>
-              <w:bottom w:w="120" w:type="dxa"/>
+              <w:top w:w="130" w:type="dxa"/>
+              <w:bottom w:w="130" w:type="dxa"/>
               <w:left w:w="180" w:type="dxa"/>
               <w:right w:w="180" w:type="dxa"/>
             </w:tcMar>
@@ -99,7 +99,28 @@
                 <w:color w:val="0369A1"/>
                 <w:sz w:val="21"/>
               </w:rPr>
-              <w:t>📘 SESI 1: AQLAN (KELAS 4 SD) • BAB 4: MENYAMBUT USIA BALIGH</w:t>
+              <w:t>📘 BAGIAN 1: CATATAN BUKU TULIS AQLAN (KELAS 4) • BAB 4: MENYAMBUT USIA BALIGH</w:t>
+              <w:br/>
+            </w:r>
+            <w:r>
+              <w:rPr>
+                <w:rFonts w:ascii="Calibri" w:hAnsi="Calibri"/>
+                <w:b/>
+                <w:i w:val="0"/>
+                <w:color w:val="0369A1"/>
+                <w:sz w:val="20"/>
+              </w:rPr>
+              <w:t>• 1. Makna Baligh &amp; Status Mukallaf:</w:t>
+              <w:br/>
+            </w:r>
+            <w:r>
+              <w:rPr>
+                <w:rFonts w:ascii="Calibri" w:hAnsi="Calibri"/>
+                <w:b w:val="0"/>
+                <w:i w:val="0"/>
+                <w:sz w:val="19"/>
+              </w:rPr>
+              <w:t xml:space="preserve">   - Baligh secara bahasa berarti sampai (sampai pada batas kedewasaan).</w:t>
               <w:br/>
             </w:r>
             <w:r>
@@ -109,7 +130,7 @@
                 <w:i w:val="0"/>
                 <w:sz w:val="19"/>
               </w:rPr>
-              <w:t xml:space="preserve">• 1. Pengertian Baligh: </w:t>
+              <w:t xml:space="preserve">   - Status Mukallaf (Lisensi Nahkoda): </w:t>
             </w:r>
             <w:r>
               <w:rPr>
@@ -118,25 +139,7 @@
                 <w:i w:val="0"/>
                 <w:sz w:val="19"/>
               </w:rPr>
-              <w:t xml:space="preserve">Menurut bahasa artinya "sampai". Menurut istilah, baligh adalah masa kedewasaan seseorang yang menandai bahwa ia telah menjadi seorang </w:t>
-            </w:r>
-            <w:r>
-              <w:rPr>
-                <w:rFonts w:ascii="Calibri" w:hAnsi="Calibri"/>
-                <w:b/>
-                <w:i w:val="0"/>
-                <w:sz w:val="19"/>
-              </w:rPr>
-              <w:t>mukallaf</w:t>
-            </w:r>
-            <w:r>
-              <w:rPr>
-                <w:rFonts w:ascii="Calibri" w:hAnsi="Calibri"/>
-                <w:b w:val="0"/>
-                <w:i w:val="0"/>
-                <w:sz w:val="19"/>
-              </w:rPr>
-              <w:t xml:space="preserve"> (wajib menjalankan syariat Islam secara mandiri).</w:t>
+              <w:t>Resmi memegang kemudi catatan amal sendiri di hadapan Allah Swt. Wajib mendirikan salat 5 waktu mandiri.</w:t>
               <w:br/>
             </w:r>
             <w:r>
@@ -146,7 +149,28 @@
                 <w:i w:val="0"/>
                 <w:sz w:val="19"/>
               </w:rPr>
-              <w:t>• 2. Tanda-Tanda Baligh:</w:t>
+              <w:t xml:space="preserve">   - Dua Buku Rekening Amal: </w:t>
+            </w:r>
+            <w:r>
+              <w:rPr>
+                <w:rFonts w:ascii="Calibri" w:hAnsi="Calibri"/>
+                <w:b w:val="0"/>
+                <w:i w:val="0"/>
+                <w:sz w:val="19"/>
+              </w:rPr>
+              <w:t>Malaikat Raqib mencatat kebaikan, Malaikat Atid mencatat kekhilafan.</w:t>
+              <w:br/>
+              <w:br/>
+            </w:r>
+            <w:r>
+              <w:rPr>
+                <w:rFonts w:ascii="Calibri" w:hAnsi="Calibri"/>
+                <w:b/>
+                <w:i w:val="0"/>
+                <w:color w:val="0369A1"/>
+                <w:sz w:val="20"/>
+              </w:rPr>
+              <w:t>• 2. Tanda-Tanda Baligh (Sains &amp; Fikih):</w:t>
               <w:br/>
             </w:r>
             <w:r>
@@ -156,7 +180,7 @@
                 <w:i w:val="0"/>
                 <w:sz w:val="19"/>
               </w:rPr>
-              <w:t xml:space="preserve">   - Ilmu Biologi (Fisik): </w:t>
+              <w:t xml:space="preserve">   - Sains Biologi: </w:t>
             </w:r>
             <w:r>
               <w:rPr>
@@ -165,7 +189,7 @@
                 <w:i w:val="0"/>
                 <w:sz w:val="19"/>
               </w:rPr>
-              <w:t>Suara bertambah berat/dalam, tumbuh jakun di leher, dada membidang, serta kelenjar keringat bertambah aktif.</w:t>
+              <w:t>Suara bertambah berat, tumbuh jakun di leher, dada membidang, kelenjar keringat aktif.</w:t>
               <w:br/>
             </w:r>
             <w:r>
@@ -175,7 +199,7 @@
                 <w:i w:val="0"/>
                 <w:sz w:val="19"/>
               </w:rPr>
-              <w:t xml:space="preserve">   - Ilmu Fikih: </w:t>
+              <w:t xml:space="preserve">   - Syariat Fikih: </w:t>
             </w:r>
             <w:r>
               <w:rPr>
@@ -184,7 +208,29 @@
                 <w:i w:val="0"/>
                 <w:sz w:val="19"/>
               </w:rPr>
-              <w:t>Mengalami mimpi basah (ihtilam) bagi laki-laki, atau telah mencapai batas usia 15 tahun (hijriyah/masehi).</w:t>
+              <w:t>Mengalami mimpi basah (ihtilam) saat tidur, atau genap berusia 15 tahun.</w:t>
+              <w:br/>
+              <w:br/>
+            </w:r>
+            <w:r>
+              <w:rPr>
+                <w:rFonts w:ascii="Calibri" w:hAnsi="Calibri"/>
+                <w:b/>
+                <w:i w:val="0"/>
+                <w:color w:val="0369A1"/>
+                <w:sz w:val="20"/>
+              </w:rPr>
+              <w:t>• 3. Mandi Wajib / Ghusl (Cuci Bersih Total):</w:t>
+              <w:br/>
+            </w:r>
+            <w:r>
+              <w:rPr>
+                <w:rFonts w:ascii="Calibri" w:hAnsi="Calibri"/>
+                <w:b w:val="0"/>
+                <w:i w:val="0"/>
+                <w:sz w:val="19"/>
+              </w:rPr>
+              <w:t xml:space="preserve">   - Mimpi basah berstatus Hadas Besar. Wajib bersuci melalui mandi wajib sebelum salat.</w:t>
               <w:br/>
             </w:r>
             <w:r>
@@ -194,7 +240,7 @@
                 <w:i w:val="0"/>
                 <w:sz w:val="19"/>
               </w:rPr>
-              <w:t xml:space="preserve">• 3. Mandi Wajib (Ghusl): </w:t>
+              <w:t xml:space="preserve">   - Dua Kunci Sah Mandi Wajib: </w:t>
             </w:r>
             <w:r>
               <w:rPr>
@@ -203,55 +249,7 @@
                 <w:i w:val="0"/>
                 <w:sz w:val="19"/>
               </w:rPr>
-              <w:t xml:space="preserve">Cara bersuci untuk menghilangkan hadas besar (mimpi basah). </w:t>
-            </w:r>
-            <w:r>
-              <w:rPr>
-                <w:rFonts w:ascii="Calibri" w:hAnsi="Calibri"/>
-                <w:b/>
-                <w:i w:val="0"/>
-                <w:sz w:val="19"/>
-              </w:rPr>
-              <w:t>Dua Rukun Sah Mandi Wajib:</w:t>
-              <w:br/>
-            </w:r>
-            <w:r>
-              <w:rPr>
-                <w:rFonts w:ascii="Calibri" w:hAnsi="Calibri"/>
-                <w:b w:val="0"/>
-                <w:i w:val="0"/>
-                <w:sz w:val="19"/>
-              </w:rPr>
-              <w:t xml:space="preserve">   a) Niat menghilangkan hadas besar karena Allah Ta'ala di dalam hati.</w:t>
-              <w:br/>
-            </w:r>
-            <w:r>
-              <w:rPr>
-                <w:rFonts w:ascii="Calibri" w:hAnsi="Calibri"/>
-                <w:b w:val="0"/>
-                <w:i w:val="0"/>
-                <w:sz w:val="19"/>
-              </w:rPr>
-              <w:t xml:space="preserve">   b) Meratakan air suci ke seluruh tubuh dari ujung rambut hingga telapak kaki.</w:t>
-              <w:br/>
-            </w:r>
-            <w:r>
-              <w:rPr>
-                <w:rFonts w:ascii="Calibri" w:hAnsi="Calibri"/>
-                <w:b/>
-                <w:i w:val="0"/>
-                <w:sz w:val="19"/>
-              </w:rPr>
-              <w:t xml:space="preserve">• 4. Kewajiban Setelah Baligh: </w:t>
-            </w:r>
-            <w:r>
-              <w:rPr>
-                <w:rFonts w:ascii="Calibri" w:hAnsi="Calibri"/>
-                <w:b w:val="0"/>
-                <w:i w:val="0"/>
-                <w:sz w:val="19"/>
-              </w:rPr>
-              <w:t>Wajib mendirikan salat fardhu 5 waktu mandiri, menutup aurat laki-laki (antara pusar dan lutut), serta menjaga pergaulan.</w:t>
+              <w:t>1) Niat di dalam hati karena Allah Ta'ala. 2) Siram dan ratakan air suci dari ujung helai rambut kepala sampai sela-sela jari kaki.</w:t>
               <w:br/>
               <w:br/>
             </w:r>
@@ -263,7 +261,7 @@
                 <w:color w:val="B45309"/>
                 <w:sz w:val="19"/>
               </w:rPr>
-              <w:t xml:space="preserve">💡 Kunci Ksatria: </w:t>
+              <w:t xml:space="preserve">   💡 Kunci Ksatria: </w:t>
             </w:r>
             <w:r>
               <w:rPr>
@@ -273,7 +271,7 @@
                 <w:color w:val="B45309"/>
                 <w:sz w:val="19"/>
               </w:rPr>
-              <w:t>"Baligh berarti siap mandiri. Jaga salat 5 waktu dan kebersihan tubuhmu!"</w:t>
+              <w:t>"Baligh berarti mandiri di hadapan Allah. Jaga salat 5 waktu dan kebersihan tubuhmu!"</w:t>
               <w:br/>
             </w:r>
           </w:p>
@@ -298,10 +296,10 @@
         <w:tc>
           <w:tcPr>
             <w:tcW w:type="dxa" w:w="9792"/>
-            <w:shd w:fill="ECFDF5"/>
+            <w:shd w:val="clear" w:color="auto" w:fill="ECFDF5"/>
             <w:tcMar>
-              <w:top w:w="120" w:type="dxa"/>
-              <w:bottom w:w="120" w:type="dxa"/>
+              <w:top w:w="130" w:type="dxa"/>
+              <w:bottom w:w="130" w:type="dxa"/>
               <w:left w:w="180" w:type="dxa"/>
               <w:right w:w="180" w:type="dxa"/>
             </w:tcMar>
@@ -317,7 +315,18 @@
                 <w:color w:val="047857"/>
                 <w:sz w:val="21"/>
               </w:rPr>
-              <w:t>📙 SESI 2: MISHKA (KELAS 5 SD) • BAB 4: HIDUP LAPANG DENGAN BERBAGI</w:t>
+              <w:t>📙 BAGIAN 2: CATATAN BUKU TULIS MISHKA (KELAS 5) • BAB 4: HIDUP LAPANG DENGAN BERBAGI</w:t>
+              <w:br/>
+            </w:r>
+            <w:r>
+              <w:rPr>
+                <w:rFonts w:ascii="Calibri" w:hAnsi="Calibri"/>
+                <w:b/>
+                <w:i w:val="0"/>
+                <w:color w:val="047857"/>
+                <w:sz w:val="20"/>
+              </w:rPr>
+              <w:t>• 1. Bentuk-Bentuk Berbagi dalam Islam (Empat Cabang Pohon Kebaikan):</w:t>
               <w:br/>
             </w:r>
             <w:r>
@@ -327,7 +336,26 @@
                 <w:i w:val="0"/>
                 <w:sz w:val="19"/>
               </w:rPr>
-              <w:t>• 1. Bentuk-Bentuk Berbagi dalam Islam:</w:t>
+              <w:t xml:space="preserve">   - 🌳 Akar Kokoh = Zakat </w:t>
+            </w:r>
+            <w:r>
+              <w:rPr>
+                <w:rFonts w:ascii="Calibri" w:hAnsi="Calibri"/>
+                <w:b/>
+                <w:i w:val="0"/>
+                <w:color w:val="047857"/>
+                <w:sz w:val="19"/>
+              </w:rPr>
+              <w:t xml:space="preserve">[Basis: Q.S. At-Taubah: 60]: </w:t>
+            </w:r>
+            <w:r>
+              <w:rPr>
+                <w:rFonts w:ascii="Calibri" w:hAnsi="Calibri"/>
+                <w:b w:val="0"/>
+                <w:i w:val="0"/>
+                <w:sz w:val="19"/>
+              </w:rPr>
+              <w:t>Hukumnya wajib bagi yang mampu dengan takaran tertentu (nisab &amp; haul) khusus untuk 8 asnaf.</w:t>
               <w:br/>
             </w:r>
             <w:r>
@@ -337,7 +365,17 @@
                 <w:i w:val="0"/>
                 <w:sz w:val="19"/>
               </w:rPr>
-              <w:t xml:space="preserve">   a) Zakat: </w:t>
+              <w:t xml:space="preserve">   - 🪵 Batang Utama = Infak </w:t>
+            </w:r>
+            <w:r>
+              <w:rPr>
+                <w:rFonts w:ascii="Calibri" w:hAnsi="Calibri"/>
+                <w:b/>
+                <w:i w:val="0"/>
+                <w:color w:val="047857"/>
+                <w:sz w:val="19"/>
+              </w:rPr>
+              <w:t xml:space="preserve">[Basis: Q.S. Ali 'Imran: 92]: </w:t>
             </w:r>
             <w:r>
               <w:rPr>
@@ -346,7 +384,7 @@
                 <w:i w:val="0"/>
                 <w:sz w:val="19"/>
               </w:rPr>
-              <w:t>Mengeluarkan sebagian harta tertentu yang hukumnya wajib bagi yang mampu dengan takaran tertentu (nisab dan haul) untuk 8 golongan yang berhak (mustahik).</w:t>
+              <w:t>Mengeluarkan harta/uang sukarela di jalan Allah untuk fasilitas umum tanpa batas nisab dan waktu.</w:t>
               <w:br/>
             </w:r>
             <w:r>
@@ -356,7 +394,17 @@
                 <w:i w:val="0"/>
                 <w:sz w:val="19"/>
               </w:rPr>
-              <w:t xml:space="preserve">   b) Infak: </w:t>
+              <w:t xml:space="preserve">   - 🍃 Ranting &amp; Daun = Sedekah </w:t>
+            </w:r>
+            <w:r>
+              <w:rPr>
+                <w:rFonts w:ascii="Calibri" w:hAnsi="Calibri"/>
+                <w:b/>
+                <w:i w:val="0"/>
+                <w:color w:val="047857"/>
+                <w:sz w:val="19"/>
+              </w:rPr>
+              <w:t xml:space="preserve">[Basis: Q.S. Al-Baqarah: 177 / Q.S. Al-Ma'arij: 24-25]: </w:t>
             </w:r>
             <w:r>
               <w:rPr>
@@ -365,7 +413,7 @@
                 <w:i w:val="0"/>
                 <w:sz w:val="19"/>
               </w:rPr>
-              <w:t>Mengeluarkan sebagian harta atau uang secara sukarela di jalan Allah untuk kemaslahatan umum tanpa batasan nisab dan waktu.</w:t>
+              <w:t>Kebaikan sukarela seluas semesta tanpa harus punya uang (senyum tulus, tutur kata santun, bantuan tenaga).</w:t>
               <w:br/>
             </w:r>
             <w:r>
@@ -375,7 +423,7 @@
                 <w:i w:val="0"/>
                 <w:sz w:val="19"/>
               </w:rPr>
-              <w:t xml:space="preserve">   c) Sedekah: </w:t>
+              <w:t xml:space="preserve">   - 🌸 Bunga Sakura = Hadiah: </w:t>
             </w:r>
             <w:r>
               <w:rPr>
@@ -384,7 +432,8 @@
                 <w:i w:val="0"/>
                 <w:sz w:val="19"/>
               </w:rPr>
-              <w:t>Segala perbuatan baik sukarela semata-mata mencari rida Allah (materi maupun non-materi: senyuman tulus, tutur kata santun, bantuan tenaga).</w:t>
+              <w:t>Pemberian barang sukarela untuk mempererat kasih sayang persahabatan (Tahadu Tahabbu).</w:t>
+              <w:br/>
               <w:br/>
             </w:r>
             <w:r>
@@ -392,9 +441,21 @@
                 <w:rFonts w:ascii="Calibri" w:hAnsi="Calibri"/>
                 <w:b/>
                 <w:i w:val="0"/>
-                <w:sz w:val="19"/>
+                <w:color w:val="047857"/>
+                <w:sz w:val="20"/>
               </w:rPr>
-              <w:t xml:space="preserve">   d) Hadiah: </w:t>
+              <w:t xml:space="preserve">• 2. Larangan dalam Berbagi </w:t>
+            </w:r>
+            <w:r>
+              <w:rPr>
+                <w:rFonts w:ascii="Calibri" w:hAnsi="Calibri"/>
+                <w:b/>
+                <w:i w:val="0"/>
+                <w:color w:val="047857"/>
+                <w:sz w:val="20"/>
+              </w:rPr>
+              <w:t>[Basis: Q.S. Al-Baqarah: 264]:</w:t>
+              <w:br/>
             </w:r>
             <w:r>
               <w:rPr>
@@ -403,7 +464,27 @@
                 <w:i w:val="0"/>
                 <w:sz w:val="19"/>
               </w:rPr>
-              <w:t>Pemberian barang secara sukarela untuk memuliakan dan mempererat tali persahabatan atau silaturahmi (Tahadu Tahabbu).</w:t>
+              <w:t xml:space="preserve">   Pahala bisa gugur licin seperti debu di atas batu licin tersapu badai jika dirusak dua sifat:</w:t>
+              <w:br/>
+            </w:r>
+            <w:r>
+              <w:rPr>
+                <w:rFonts w:ascii="Calibri" w:hAnsi="Calibri"/>
+                <w:b w:val="0"/>
+                <w:i w:val="0"/>
+                <w:sz w:val="19"/>
+              </w:rPr>
+              <w:t xml:space="preserve">   - Mengungkit-ungkit pemberian (Al-Mann)</w:t>
+              <w:br/>
+            </w:r>
+            <w:r>
+              <w:rPr>
+                <w:rFonts w:ascii="Calibri" w:hAnsi="Calibri"/>
+                <w:b w:val="0"/>
+                <w:i w:val="0"/>
+                <w:sz w:val="19"/>
+              </w:rPr>
+              <w:t xml:space="preserve">   - Menyakiti hati penerima (Al-Adza)</w:t>
               <w:br/>
               <w:br/>
             </w:r>
@@ -412,9 +493,11 @@
                 <w:rFonts w:ascii="Calibri" w:hAnsi="Calibri"/>
                 <w:b/>
                 <w:i w:val="0"/>
-                <w:sz w:val="19"/>
+                <w:color w:val="047857"/>
+                <w:sz w:val="20"/>
               </w:rPr>
-              <w:t xml:space="preserve">• 2. Larangan dalam Berbagi (Q.S. Al-Baqarah: 264): </w:t>
+              <w:t>• 3. Keanggunan 'Tangan di Atas' (Adab Berbagi):</w:t>
+              <w:br/>
             </w:r>
             <w:r>
               <w:rPr>
@@ -423,16 +506,8 @@
                 <w:i w:val="0"/>
                 <w:sz w:val="19"/>
               </w:rPr>
-              <w:t>Dilarang mengungkit-ungkit pemberian (</w:t>
-            </w:r>
-            <w:r>
-              <w:rPr>
-                <w:rFonts w:ascii="Calibri" w:hAnsi="Calibri"/>
-                <w:b/>
-                <w:i w:val="0"/>
-                <w:sz w:val="19"/>
-              </w:rPr>
-              <w:t>Al-Mann</w:t>
+              <w:t xml:space="preserve">   - Memberi dengan ikhlas tanpa kamera/pamer medsos.</w:t>
+              <w:br/>
             </w:r>
             <w:r>
               <w:rPr>
@@ -441,45 +516,7 @@
                 <w:i w:val="0"/>
                 <w:sz w:val="19"/>
               </w:rPr>
-              <w:t>) dan dilarang menyakiti perasaan penerima (</w:t>
-            </w:r>
-            <w:r>
-              <w:rPr>
-                <w:rFonts w:ascii="Calibri" w:hAnsi="Calibri"/>
-                <w:b/>
-                <w:i w:val="0"/>
-                <w:sz w:val="19"/>
-              </w:rPr>
-              <w:t>Al-Adza</w:t>
-            </w:r>
-            <w:r>
-              <w:rPr>
-                <w:rFonts w:ascii="Calibri" w:hAnsi="Calibri"/>
-                <w:b w:val="0"/>
-                <w:i w:val="0"/>
-                <w:sz w:val="19"/>
-              </w:rPr>
-              <w:t>) karena dapat menghapus dan membatalkan pahala.</w:t>
-              <w:br/>
-              <w:br/>
-            </w:r>
-            <w:r>
-              <w:rPr>
-                <w:rFonts w:ascii="Calibri" w:hAnsi="Calibri"/>
-                <w:b/>
-                <w:i w:val="0"/>
-                <w:sz w:val="19"/>
-              </w:rPr>
-              <w:t xml:space="preserve">• 3. Keutamaan Memberi: </w:t>
-            </w:r>
-            <w:r>
-              <w:rPr>
-                <w:rFonts w:ascii="Calibri" w:hAnsi="Calibri"/>
-                <w:b w:val="0"/>
-                <w:i w:val="0"/>
-                <w:sz w:val="19"/>
-              </w:rPr>
-              <w:t>Memberi dengan ikhlas, menjaga kehormatan penerima, serta mengamalkan prinsip "tangan di atas lebih baik daripada tangan di bawah".</w:t>
+              <w:t xml:space="preserve">   - Menjaga kehormatan dan martabat orang yang dibantu (H.R. Bukhari: tangan di atas lebih baik dari tangan di bawah).</w:t>
               <w:br/>
               <w:br/>
             </w:r>
@@ -491,7 +528,7 @@
                 <w:color w:val="065F46"/>
                 <w:sz w:val="19"/>
               </w:rPr>
-              <w:t xml:space="preserve">💡 Kunci Kasih Sayang: </w:t>
+              <w:t xml:space="preserve">   💡 Kunci Kasih Sayang: </w:t>
             </w:r>
             <w:r>
               <w:rPr>
@@ -501,7 +538,7 @@
                 <w:color w:val="065F46"/>
                 <w:sz w:val="19"/>
               </w:rPr>
-              <w:t>"Bersedekah tidak mengurangi harta, melainkan mendatangkan keberkahan jiwa!"</w:t>
+              <w:t>"Berbagi tidak mengurangi harta, melainkan menumbuhkan keberkahan dan ketenangan jiwa!"</w:t>
               <w:br/>
             </w:r>
           </w:p>

</xml_diff>